<commit_message>
feat: sync latest IMS changes
</commit_message>
<xml_diff>
--- a/ims-main/docs/文档编写规范.docx
+++ b/ims-main/docs/文档编写规范.docx
@@ -2,46 +2,6 @@
 <file path=word/document.xml><?xml version="1.0" encoding="utf-8"?>
 <w:document xmlns:w="http://schemas.openxmlformats.org/wordprocessingml/2006/main" xmlns:m="http://schemas.openxmlformats.org/officeDocument/2006/math" xmlns:r="http://schemas.openxmlformats.org/officeDocument/2006/relationships" xmlns:o="urn:schemas-microsoft-com:office:office" xmlns:v="urn:schemas-microsoft-com:vml" xmlns:w10="urn:schemas-microsoft-com:office:word" xmlns:a="http://schemas.openxmlformats.org/drawingml/2006/main" xmlns:pic="http://schemas.openxmlformats.org/drawingml/2006/picture" xmlns:wp="http://schemas.openxmlformats.org/drawingml/2006/wordprocessingDrawing">
   <w:body>
-    <w:p>
-      <w:pPr>
-        <w:pStyle w:val="Title"/>
-      </w:pPr>
-      <w:r>
-        <w:t xml:space="preserve">IMS </w:t>
-      </w:r>
-      <w:r>
-        <w:rPr>
-          <w:rFonts w:hint="eastAsia"/>
-        </w:rPr>
-        <w:t xml:space="preserve">文档编写规范</w:t>
-      </w:r>
-    </w:p>
-    <w:sdt>
-      <w:sdtPr>
-        <w:docPartObj>
-          <w:docPartGallery w:val="Table of Contents"/>
-          <w:docPartUnique/>
-        </w:docPartObj>
-      </w:sdtPr>
-      <w:sdtContent>
-        <w:p>
-          <w:pPr>
-            <w:pStyle w:val="TOCHeading"/>
-          </w:pPr>
-          <w:r>
-            <w:t xml:space="preserve">Table of Contents</w:t>
-          </w:r>
-        </w:p>
-        <w:p>
-          <w:r>
-            <w:fldChar w:fldCharType="begin" w:dirty="true"/>
-            <w:instrText xml:space="preserve">TOC \o "1-3" \h \z \u</w:instrText>
-            <w:fldChar w:fldCharType="separate"/>
-            <w:fldChar w:fldCharType="end"/>
-          </w:r>
-        </w:p>
-      </w:sdtContent>
-    </w:sdt>
     <w:bookmarkStart w:id="46" w:name="ims-文档编写规范-v2.0"/>
     <w:p>
       <w:pPr>

</xml_diff>